<commit_message>
feat: publish completed CBU Find case study
</commit_message>
<xml_diff>
--- a/portfolio-site/public/documents/Leo-Mabuku-Resume.docx
+++ b/portfolio-site/public/documents/Leo-Mabuku-Resume.docx
@@ -605,7 +605,7 @@
           <w:color w:val="545C63"/>
           <w:sz w:val="18"/>
         </w:rPr>
-        <w:t xml:space="preserve"> | Kotlin, Next.js, Firebase — </w:t>
+        <w:t xml:space="preserve"> | Kotlin, React, Firebase, Cloudflare — </w:t>
       </w:r>
       <w:r>
         <w:rPr>
@@ -613,7 +613,7 @@
           <w:color w:val="20262B"/>
           <w:sz w:val="18"/>
         </w:rPr>
-        <w:t>Cross-platform campus lost-and-found with authentication, image reports, search and private item-linked conversations.</w:t>
+        <w:t>Completed cross-platform campus lost-and-found with verified claims, private handover messaging, signed media, push notifications, moderation and report resolution.</w:t>
       </w:r>
     </w:p>
     <w:p>

</xml_diff>